<commit_message>
auto(daily): dev loop report 2026-06-11
</commit_message>
<xml_diff>
--- a/reports/hypothesis/2026-06-11.docx
+++ b/reports/hypothesis/2026-06-11.docx
@@ -15,7 +15,7 @@
         <w:rPr>
           <w:i/>
         </w:rPr>
-        <w:t>생성일: 2026-06-11 09:15 KST  |  표본: 측정소당 최소 2412건 / 총 12235건</w:t>
+        <w:t>생성일: 2026-06-11 13:57 KST  |  표본: 측정소당 최소 2417건 / 총 12260건</w:t>
       </w:r>
     </w:p>
     <w:p>
@@ -143,7 +143,7 @@
           </w:tcPr>
           <w:p>
             <w:r>
-              <w:t>37.049</w:t>
+              <w:t>37.024</w:t>
             </w:r>
           </w:p>
         </w:tc>
@@ -153,7 +153,7 @@
           </w:tcPr>
           <w:p>
             <w:r>
-              <w:t>33.971</w:t>
+              <w:t>33.944</w:t>
             </w:r>
           </w:p>
         </w:tc>
@@ -163,7 +163,7 @@
           </w:tcPr>
           <w:p>
             <w:r>
-              <w:t>+3.078</w:t>
+              <w:t>+3.080</w:t>
             </w:r>
           </w:p>
         </w:tc>
@@ -215,7 +215,7 @@
           </w:tcPr>
           <w:p>
             <w:r>
-              <w:t>20.666</w:t>
+              <w:t>20.656</w:t>
             </w:r>
           </w:p>
         </w:tc>
@@ -225,7 +225,7 @@
           </w:tcPr>
           <w:p>
             <w:r>
-              <w:t>17.609</w:t>
+              <w:t>17.608</w:t>
             </w:r>
           </w:p>
         </w:tc>
@@ -235,7 +235,7 @@
           </w:tcPr>
           <w:p>
             <w:r>
-              <w:t>+3.057</w:t>
+              <w:t>+3.049</w:t>
             </w:r>
           </w:p>
         </w:tc>
@@ -287,7 +287,7 @@
           </w:tcPr>
           <w:p>
             <w:r>
-              <w:t>0.047</w:t>
+              <w:t>0.048</w:t>
             </w:r>
           </w:p>
         </w:tc>
@@ -660,7 +660,7 @@
           </w:tcPr>
           <w:p>
             <w:r>
-              <w:t>32.11</w:t>
+              <w:t>32.12</w:t>
             </w:r>
           </w:p>
         </w:tc>
@@ -722,7 +722,7 @@
           </w:tcPr>
           <w:p>
             <w:r>
-              <w:t>78.54</w:t>
+              <w:t>78.59</w:t>
             </w:r>
           </w:p>
         </w:tc>
@@ -784,7 +784,7 @@
           </w:tcPr>
           <w:p>
             <w:r>
-              <w:t>11.05</w:t>
+              <w:t>11.13</w:t>
             </w:r>
           </w:p>
         </w:tc>
@@ -846,7 +846,7 @@
           </w:tcPr>
           <w:p>
             <w:r>
-              <w:t>156.28</w:t>
+              <w:t>156.52</w:t>
             </w:r>
           </w:p>
         </w:tc>
@@ -908,7 +908,7 @@
           </w:tcPr>
           <w:p>
             <w:r>
-              <w:t>67.76</w:t>
+              <w:t>67.16</w:t>
             </w:r>
           </w:p>
         </w:tc>
@@ -970,7 +970,7 @@
           </w:tcPr>
           <w:p>
             <w:r>
-              <w:t>144.69</w:t>
+              <w:t>144.37</w:t>
             </w:r>
           </w:p>
         </w:tc>
@@ -1029,7 +1029,7 @@
         <w:pStyle w:val="ListBullet"/>
       </w:pPr>
       <w:r>
-        <w:t>'산단 영향군'가 '베이스라인'보다 평균 3.06 높음 (p=0.0000, 효과크기 작음 d=0.23).</w:t>
+        <w:t>'산단 영향군'가 '베이스라인'보다 평균 3.05 높음 (p=0.0000, 효과크기 작음 d=0.23).</w:t>
       </w:r>
     </w:p>
     <w:p>

</xml_diff>